<commit_message>
Add Aluminium coverage to Portfolio tab's Regime/Carry-Momentum research note; update strategy docs
The Regime & Carry Momentum Research expander on Tab 10 only covered
Copper for R2 and the Carry-Momentum placement table, while the
Hartree-bound report already had full Aluminium numbers for both.
Brought the dashboard note up to parity with the doc so both surfaces
tell the same story. Also refreshes the two strategy reference docs
(one-pager + full report) with numbers re-verified against the live
app engine.

Claude-Session: https://claude.ai/code/session_01MLUZh81qM63XvgMJj4CCAa
</commit_message>
<xml_diff>
--- a/docs/Metals_RiskPremia_Strategy_Summary_ProfIlia_v2.docx
+++ b/docs/Metals_RiskPremia_Strategy_Summary_ProfIlia_v2.docx
@@ -62,7 +62,7 @@
     </w:p>
     <w:p>
       <w:r>
-        <w:t>The central result is the diversification thesis at the heart of the framework: three economically distinct, near-uncorrelated return sources combine into a portfolio whose risk-adjusted return materially exceeds any single sleeve. For Copper the equal-weight portfolio earns a net Sharpe of 0.72 over the full sample (best single sleeve 0.62, Momentum); for Aluminium it earns 0.85 (best single sleeve 0.64). The portfolio also cuts drawdown roughly in half versus the individual signals.</w:t>
+        <w:t>The central result is the diversification thesis at the heart of the framework: three economically distinct, near-uncorrelated return sources combine into a portfolio whose risk-adjusted return materially exceeds any single sleeve. For Copper the equal-weight portfolio earns a net Sharpe of 0.73 over the full sample (best single sleeve 0.62, Momentum); for Aluminium it earns 0.85 (best single sleeve 0.64). The portfolio also cuts drawdown roughly in half versus the individual signals.</w:t>
       </w:r>
     </w:p>
     <w:p>
@@ -232,7 +232,7 @@
           </w:tcPr>
           <w:p>
             <w:r>
-              <w:t>0.72</w:t>
+              <w:t>0.73</w:t>
             </w:r>
           </w:p>
         </w:tc>
@@ -325,7 +325,7 @@
               <w:rPr>
                 <w:sz w:val="19"/>
               </w:rPr>
-              <w:t>0.61</w:t>
+              <w:t>0.60</w:t>
             </w:r>
           </w:p>
         </w:tc>
@@ -1026,7 +1026,7 @@
           </w:tcPr>
           <w:p>
             <w:r>
-              <w:t>+15.9%</w:t>
+              <w:t>+16.2%</w:t>
             </w:r>
           </w:p>
         </w:tc>
@@ -1036,7 +1036,7 @@
           </w:tcPr>
           <w:p>
             <w:r>
-              <w:t>-53%</w:t>
+              <w:t>-52%</w:t>
             </w:r>
           </w:p>
         </w:tc>
@@ -1098,7 +1098,7 @@
           </w:tcPr>
           <w:p>
             <w:r>
-              <w:t>+13.0%</w:t>
+              <w:t>+13.2%</w:t>
             </w:r>
           </w:p>
         </w:tc>
@@ -1140,7 +1140,6 @@
                 <w:b/>
                 <w:sz w:val="19"/>
               </w:rPr>
-              <w:lastRenderedPageBreak/>
               <w:t>Aluminium - full sample</w:t>
             </w:r>
           </w:p>
@@ -1265,7 +1264,7 @@
               <w:rPr>
                 <w:sz w:val="19"/>
               </w:rPr>
-              <w:t>0.37</w:t>
+              <w:t>0.38</w:t>
             </w:r>
           </w:p>
         </w:tc>
@@ -1282,7 +1281,7 @@
               <w:rPr>
                 <w:sz w:val="19"/>
               </w:rPr>
-              <w:t>0.36</w:t>
+              <w:t>0.38</w:t>
             </w:r>
           </w:p>
         </w:tc>
@@ -1299,7 +1298,7 @@
               <w:rPr>
                 <w:sz w:val="19"/>
               </w:rPr>
-              <w:t>+8.7%</w:t>
+              <w:t>+9.1%</w:t>
             </w:r>
           </w:p>
         </w:tc>
@@ -1535,11 +1534,9 @@
         <w:rPr>
           <w:b/>
         </w:rPr>
-        <w:t xml:space="preserve">Aluminium. </w:t>
-      </w:r>
-      <w:r>
-        <w:t xml:space="preserve"> the 20-day carry-momentum is effectively dead on Aluminium; the 252-day z-score is the winner there (net 0.64 IS, OOS 0.83), matching its smoother curve dynamics.</w:t>
-      </w:r>
+        <w:t>Aluminium.  the 20-day carry-momentum is effectively dead on Aluminium; the 252-day z-score is the winner there (net 0.64 IS, OOS 0.89), matching its smoother curve dynamics.</w:t>
+      </w:r>
+      <w:r/>
     </w:p>
     <w:p>
       <w:pPr>
@@ -1871,7 +1868,7 @@
               <w:rPr>
                 <w:sz w:val="19"/>
               </w:rPr>
-              <w:t>0.71</w:t>
+              <w:t>0.72</w:t>
             </w:r>
           </w:p>
         </w:tc>
@@ -1888,7 +1885,7 @@
               <w:rPr>
                 <w:sz w:val="19"/>
               </w:rPr>
-              <w:t>0.64</w:t>
+              <w:t>0.65</w:t>
             </w:r>
           </w:p>
         </w:tc>
@@ -1905,7 +1902,7 @@
               <w:rPr>
                 <w:sz w:val="19"/>
               </w:rPr>
-              <w:t>+14.8%</w:t>
+              <w:t>+15.1%</w:t>
             </w:r>
           </w:p>
         </w:tc>
@@ -2085,7 +2082,7 @@
               <w:rPr>
                 <w:sz w:val="19"/>
               </w:rPr>
-              <w:t>0.33</w:t>
+              <w:t>0.32</w:t>
             </w:r>
           </w:p>
         </w:tc>
@@ -2102,7 +2099,7 @@
               <w:rPr>
                 <w:sz w:val="19"/>
               </w:rPr>
-              <w:t>0.30</w:t>
+              <w:t>0.28</w:t>
             </w:r>
           </w:p>
         </w:tc>
@@ -2119,7 +2116,7 @@
               <w:rPr>
                 <w:sz w:val="19"/>
               </w:rPr>
-              <w:t>+7.9%</w:t>
+              <w:t>+7.5%</w:t>
             </w:r>
           </w:p>
         </w:tc>
@@ -2185,7 +2182,7 @@
     </w:p>
     <w:p>
       <w:r>
-        <w:t>Copper carry was the best-performing sleeve of the last five years (net 0.64), as repeated inventory squeezes and backwardation episodes in 2021-2024 played directly to the curve-momentum signal. Aluminium carry, very strong over the full sample, was more subdued recently (net 0.30) as the curve spent long stretches in stable contango; the z-score still added positive, low-turnover return and diversified the trend sleeve.</w:t>
+        <w:t>Copper carry was the best-performing sleeve of the last five years (net 0.65), as repeated inventory squeezes and backwardation episodes in 2021-2024 played directly to the curve-momentum signal. Aluminium carry, very strong over the full sample, was more subdued recently (net 0.28) as the curve spent long stretches in stable contango; the z-score still added positive, low-turnover return and diversified the trend sleeve.</w:t>
       </w:r>
     </w:p>
     <w:p>
@@ -2395,11 +2392,9 @@
         <w:rPr>
           <w:b/>
         </w:rPr>
-        <w:t xml:space="preserve">IS vs OOS. </w:t>
-      </w:r>
-      <w:r>
-        <w:t xml:space="preserve"> the V1 MA-reversion is robust out-of-sample (Copper OOS 0.36), whereas the V2 reversal's in-sample strength is a 2020-21 dislocation mirage that disappears OOS. V1 is therefore the default; V2 is shown only to demonstrate why it is not used.</w:t>
-      </w:r>
+        <w:t>IS vs OOS.  the V1 MA-reversion is robust out-of-sample (Copper OOS 0.77), whereas the V2 reversal's in-sample strength is a 2020-21 dislocation mirage that disappears OOS. V1 is therefore the default; V2 is shown only to demonstrate why it is not used.</w:t>
+      </w:r>
+      <w:r/>
     </w:p>
     <w:p>
       <w:pPr>
@@ -2623,7 +2618,7 @@
               <w:rPr>
                 <w:sz w:val="19"/>
               </w:rPr>
-              <w:t>0.28</w:t>
+              <w:t>0.33</w:t>
             </w:r>
           </w:p>
         </w:tc>
@@ -2640,7 +2635,7 @@
               <w:rPr>
                 <w:sz w:val="19"/>
               </w:rPr>
-              <w:t>0.27</w:t>
+              <w:t>0.32</w:t>
             </w:r>
           </w:p>
         </w:tc>
@@ -2657,7 +2652,7 @@
               <w:rPr>
                 <w:sz w:val="19"/>
               </w:rPr>
-              <w:t>+3.8%</w:t>
+              <w:t>+4.5%</w:t>
             </w:r>
           </w:p>
         </w:tc>
@@ -2730,7 +2725,7 @@
               <w:rPr>
                 <w:sz w:val="19"/>
               </w:rPr>
-              <w:t>-0.02</w:t>
+              <w:t>0.03</w:t>
             </w:r>
           </w:p>
         </w:tc>
@@ -2747,7 +2742,7 @@
               <w:rPr>
                 <w:sz w:val="19"/>
               </w:rPr>
-              <w:t>-0.03</w:t>
+              <w:t>0.02</w:t>
             </w:r>
           </w:p>
         </w:tc>
@@ -2764,7 +2759,7 @@
               <w:rPr>
                 <w:sz w:val="19"/>
               </w:rPr>
-              <w:t>-0.3%</w:t>
+              <w:t>+0.5%</w:t>
             </w:r>
           </w:p>
         </w:tc>
@@ -2781,7 +2776,7 @@
               <w:rPr>
                 <w:sz w:val="19"/>
               </w:rPr>
-              <w:t>-46%</w:t>
+              <w:t>-45%</w:t>
             </w:r>
           </w:p>
         </w:tc>
@@ -2798,7 +2793,7 @@
               <w:rPr>
                 <w:sz w:val="19"/>
               </w:rPr>
-              <w:t>25%</w:t>
+              <w:t>26%</w:t>
             </w:r>
           </w:p>
         </w:tc>
@@ -2837,7 +2832,7 @@
               <w:rPr>
                 <w:sz w:val="19"/>
               </w:rPr>
-              <w:t>0.27</w:t>
+              <w:t>0.24</w:t>
             </w:r>
           </w:p>
         </w:tc>
@@ -2854,7 +2849,7 @@
               <w:rPr>
                 <w:sz w:val="19"/>
               </w:rPr>
-              <w:t>0.26</w:t>
+              <w:t>0.23</w:t>
             </w:r>
           </w:p>
         </w:tc>
@@ -2871,7 +2866,7 @@
               <w:rPr>
                 <w:sz w:val="19"/>
               </w:rPr>
-              <w:t>+3.1%</w:t>
+              <w:t>+2.8%</w:t>
             </w:r>
           </w:p>
         </w:tc>
@@ -2888,7 +2883,7 @@
               <w:rPr>
                 <w:sz w:val="19"/>
               </w:rPr>
-              <w:t>-68%</w:t>
+              <w:t>-71%</w:t>
             </w:r>
           </w:p>
         </w:tc>
@@ -2944,7 +2939,7 @@
               <w:rPr>
                 <w:sz w:val="19"/>
               </w:rPr>
-              <w:t>0.16</w:t>
+              <w:t>0.24</w:t>
             </w:r>
           </w:p>
         </w:tc>
@@ -2961,7 +2956,7 @@
               <w:rPr>
                 <w:sz w:val="19"/>
               </w:rPr>
-              <w:t>0.15</w:t>
+              <w:t>0.24</w:t>
             </w:r>
           </w:p>
         </w:tc>
@@ -2978,7 +2973,7 @@
               <w:rPr>
                 <w:sz w:val="19"/>
               </w:rPr>
-              <w:t>+2.4%</w:t>
+              <w:t>+3.7%</w:t>
             </w:r>
           </w:p>
         </w:tc>
@@ -3028,7 +3023,7 @@
         <w:rPr>
           <w:i/>
         </w:rPr>
-        <w:t>Walk-forward OOS Sharpe (net 5 bps, average across the rolling 1yr windows): Copper +0.75, Aluminium +0.62. The per-window average flatters value because it trades selectively (flat ~40-50% of days); its full-sample (+0.27) and trailing-5y Sharpes are the more representative stand-alone figures.</w:t>
+        <w:t>Walk-forward OOS Sharpe (net 5 bps, average across the rolling 1yr windows): Copper +0.77, Aluminium +0.73. The per-window average flatters value because it trades selectively (flat ~40-50% of days); its full-sample (+0.32) and trailing-5y Sharpes are the more representative stand-alone figures.</w:t>
       </w:r>
     </w:p>
     <w:p>
@@ -3044,8 +3039,7 @@
     </w:p>
     <w:p>
       <w:r>
-        <w:lastRenderedPageBreak/>
-        <w:t>Value is regime-conditional: most of its full-sample edge came from the 2020-2021 dislocation. Over the trailing five years Copper value was essentially flat-to-slightly-negative - a reminder it is not a stand-alone strategy - while Aluminium value stayed modestly positive (net 0.15). Its role is confirmed not by stand-alone Sharpe but by its diversification: it is the sleeve that turns contrarian when momentum is most exposed, which is exactly why it earns its third of the portfolio.</w:t>
+        <w:t>Value is regime-conditional: most of its full-sample edge came from the 2020-2021 dislocation. Over the trailing five years Copper value was essentially flat (net +0.02) - a reminder it is not a stand-alone strategy - while Aluminium value stayed solidly positive (net +0.24). Its role is confirmed not by stand-alone Sharpe but by its diversification: it is the sleeve that turns contrarian when momentum is most exposed, which is exactly why it earns its third of the portfolio.</w:t>
       </w:r>
     </w:p>
     <w:p>
@@ -3255,7 +3249,7 @@
         <w:rPr>
           <w:b/>
         </w:rPr>
-        <w:t xml:space="preserve">Why it ends up near equal-weight. </w:t>
+        <w:t>Why it ends up near equal-weight. because the three sleeves have broadly similar realised volatility, 1/sigma is similar for all three, so the average weights land close to equal (the dashboard shows the live averages, e.g. about 0.26 / 0.26 / 0.39 for Copper - Value carries a larger share here because it turns over far less than the two trend/carry legs). Inverse-vol and equal-weight are close substitutes for Copper: full-sample Sharpe is close (0.78 vs 0.73, inverse-vol slightly ahead here), and inverse-vol has a materially shallower full-sample drawdown (-14% vs -25%); over the trailing five years the two converge further (net 0.91 vs 0.88, both around -12% drawdown). Equal-weight remains the default for simplicity.</w:t>
       </w:r>
       <w:r/>
       <w:r>
@@ -3263,7 +3257,6 @@
       </w:r>
       <w:r>
         <w:rPr/>
-        <w:t>because the three sleeves have broadly similar realised volatility, 1/sigma is similar for all three, so the average weights land close to equal (the dashboard shows the live averages, e.g. about 0.26 / 0.26 / 0.39 for Copper - Value carries a larger share here because it turns over far less than the two trend/carry legs). Inverse-vol and equal-weight are close substitutes for Copper: full-sample Sharpe is close (0.78 vs 0.72, inverse-vol slightly ahead here), and inverse-vol has a materially shallower full-sample drawdown (-14% vs -25%); over the trailing five years the two converge further (net 0.91 vs 0.88, both around -12% drawdown). Equal-weight remains the default for simplicity.</w:t>
       </w:r>
     </w:p>
     <w:p>
@@ -3631,7 +3624,7 @@
           </w:tcPr>
           <w:p>
             <w:r>
-              <w:t>+0.11</w:t>
+              <w:t>+0.13</w:t>
             </w:r>
           </w:p>
         </w:tc>
@@ -3680,7 +3673,7 @@
           </w:tcPr>
           <w:p>
             <w:r>
-              <w:t>-0.23</w:t>
+              <w:t>-0.21</w:t>
             </w:r>
           </w:p>
         </w:tc>
@@ -3729,7 +3722,7 @@
           </w:tcPr>
           <w:p>
             <w:r>
-              <w:t>-0.06</w:t>
+              <w:t>-0.04</w:t>
             </w:r>
           </w:p>
         </w:tc>
@@ -3759,7 +3752,7 @@
     </w:p>
     <w:p>
       <w:r>
-        <w:t>All pairwise correlations are below 0.25 in magnitude, and momentum-value is meaningfully negative. Combining three roughly independent sources of similar Sharpe lifts the portfolio Sharpe well above any single sleeve and roughly halves the drawdown.</w:t>
+        <w:t>Correlations are modest across the board (Copper below 0.25 in magnitude on all three pairs; Aluminium's momentum-value link is more meaningfully negative at -0.36, the strongest diversification pair in the framework). Combining three roughly independent sources of similar Sharpe lifts the portfolio Sharpe well above any single sleeve and roughly halves the drawdown.</w:t>
       </w:r>
     </w:p>
     <w:p>
@@ -3952,7 +3945,7 @@
           </w:tcPr>
           <w:p>
             <w:r>
-              <w:t>0.72</w:t>
+              <w:t>0.73</w:t>
             </w:r>
           </w:p>
         </w:tc>
@@ -3962,7 +3955,7 @@
           </w:tcPr>
           <w:p>
             <w:r>
-              <w:t>+8.0%</w:t>
+              <w:t>+8.7%</w:t>
             </w:r>
           </w:p>
         </w:tc>
@@ -3972,7 +3965,7 @@
           </w:tcPr>
           <w:p>
             <w:r>
-              <w:t>-25%</w:t>
+              <w:t>-24%</w:t>
             </w:r>
           </w:p>
         </w:tc>
@@ -3982,7 +3975,7 @@
           </w:tcPr>
           <w:p>
             <w:r>
-              <w:t>17%</w:t>
+              <w:t>18%</w:t>
             </w:r>
           </w:p>
         </w:tc>
@@ -4034,7 +4027,7 @@
           </w:tcPr>
           <w:p>
             <w:r>
-              <w:t>+9.9%</w:t>
+              <w:t>+10.3%</w:t>
             </w:r>
           </w:p>
         </w:tc>
@@ -4044,7 +4037,7 @@
           </w:tcPr>
           <w:p>
             <w:r>
-              <w:t>-12%</w:t>
+              <w:t>-11%</w:t>
             </w:r>
           </w:p>
         </w:tc>
@@ -4200,7 +4193,7 @@
               <w:rPr>
                 <w:sz w:val="19"/>
               </w:rPr>
-              <w:t>0.64</w:t>
+              <w:t>0.62</w:t>
             </w:r>
           </w:p>
         </w:tc>
@@ -4217,7 +4210,7 @@
               <w:rPr>
                 <w:sz w:val="19"/>
               </w:rPr>
-              <w:t>0.61</w:t>
+              <w:t>0.59</w:t>
             </w:r>
           </w:p>
         </w:tc>
@@ -4234,7 +4227,7 @@
               <w:rPr>
                 <w:sz w:val="19"/>
               </w:rPr>
-              <w:t>+6.3%</w:t>
+              <w:t>+6.2%</w:t>
             </w:r>
           </w:p>
         </w:tc>
@@ -4289,7 +4282,7 @@
     </w:p>
     <w:p>
       <w:r>
-        <w:t>The portfolio dominates every individual sleeve on both metals and on both the full sample and the trailing five years. Its drawdown is markedly smaller than any individual sleeve (Copper -12% over the trailing five years versus -32% to -45% for the individual sleeves). The Aluminium walk-forward Sharpe of 1.12 - higher than its in-sample 0.85 - is strong evidence the combination is not over-fit.</w:t>
+        <w:t>The portfolio dominates every individual sleeve on both metals and on both the full sample and the trailing five years. Its drawdown is markedly smaller than any individual sleeve (Copper -11% over the trailing five years versus -32% to -45% for the individual sleeves). The Aluminium walk-forward Sharpe of 1.12 - higher than its in-sample 0.85 - is strong evidence the combination is not over-fit.</w:t>
       </w:r>
     </w:p>
     <w:p>
@@ -4750,7 +4743,7 @@
         <w:pStyle w:val="ListBullet"/>
       </w:pPr>
       <w:r>
-        <w:t xml:space="preserve"> open question for Hartree: two Portfolio leg choices were changed from the original grid-optimal configuration for trader-realism / taxonomy reasons rather than pure backtest performance - the Momentum leg (MA(35,43) to MA(20,45), see 3.3) and the Carry leg used inside the Portfolio only (Carry-momentum-20d to Z-score-252d, see 4.3 and 6.6). Combined, these cost real Sharpe versus the original all-grid-optimal configuration (EW net 0.72 vs 1.00 full-sample; walk-forward OOS +0.41 vs +0.68), while trailing-five-year performance is closer (net 0.88 vs 0.92). We would like Hartree's view on whether convention-realism and taxonomy cleanliness should outweigh a Sharpe cost of this size for a systematic implementation, or whether the grid-optimal parameters are preferable regardless of how a discretionary desk would frame them. The Carry Momentum research note (6.6) proposes a way to recover some of this cost without abandoning the cleaner taxonomy.</w:t>
+        <w:t xml:space="preserve"> open question for Hartree: two Portfolio leg choices were changed from the original grid-optimal configuration for trader-realism / taxonomy reasons rather than pure backtest performance - the Momentum leg (MA(35,43) to MA(20,45), see 3.3) and the Carry leg used inside the Portfolio only (Carry-momentum-20d to Z-score-252d, see 4.3 and 6.6). Combined, these cost real Sharpe versus the original all-grid-optimal configuration (EW net 0.73 vs 1.00 full-sample; walk-forward OOS +0.41 vs +0.68), while trailing-five-year performance is closer (net 0.88 vs 0.93). We would like Hartree's view on whether convention-realism and taxonomy cleanliness should outweigh a Sharpe cost of this size for a systematic implementation, or whether the grid-optimal parameters are preferable regardless of how a discretionary desk would frame them. The Carry Momentum research note (6.6) proposes a way to recover some of this cost without abandoning the cleaner taxonomy.</w:t>
       </w:r>
     </w:p>
     <w:p>

</xml_diff>